<commit_message>
Corrige le bug critique de format d'entrée en recherche web, décontamine les stats drift, ajoute la fenêtre de visualisation/récupération auto du drift, enrichit le corpus africain et fiabilise l'entraînement
- web_search.py : reproduit exactement le format d'entraînement "{title} [SEP] {body}" (bug causant un taux de fake anormalement élevé)
- Décontamination MongoDB/Elasticsearch + drift-injector désactivé par défaut (docker-compose.yml)
- Seuil de classification relevé à 0.75 (nlp_classifier.py, web_search.py)
- Cycle drift → fenêtre de visualisation (1-10 min) → retour automatique à la normale (inject_drift_simulation.py, drift.py, app.py)
- Enrichissement du corpus africain via MasakhaNEWS (download_african_datasets.py), africa_boost dans train_model.py
- Reprise sur checkpoint pour l'entraînement CPU longue durée (résilience aux coupures disque)
- Mise à jour des documents .docx (v2.4) + export PDF
</commit_message>
<xml_diff>
--- a/Memoire_Master2_IBDIA_KOMOSSI_Sosso_v5.docx
+++ b/Memoire_Master2_IBDIA_KOMOSSI_Sosso_v5.docx
@@ -53457,6 +53457,109 @@
     <w:p>
       <w:r>
         <w:t>Après déplacement du projet du disque local5 vers le disque local6, quatre containers (spark-app, api, rss-producer, drift-injector) conservaient les anciens chemins de montage (bind mounts) et échouaient au démarrage avec des erreurs « No such file or directory ». Correction : arrêt et suppression des containers via docker compose stop + rm, puis recréation par docker compose up -d. Les volumes nommés Docker (mongodb_data, elasticsearch_data, kafka_data, grafana_data) n'ont pas été supprimés et aucune donnée n'a été perdue.</w:t>
+      </w:r>
+    </w:p>
+    <w:p/>
+    <w:p>
+      <w:pPr/>
+      <w:r>
+        <w:t>Mises à jour Version 2.4</w:t>
+      </w:r>
+    </w:p>
+    <w:p>
+      <w:r>
+        <w:t>La version 2.4 (juillet 2026) corrige un bug critique responsable d'un taux de fake anormalement élevé sur la recherche web, décontamine les statistiques polluées par des données de simulation, renforce le contexte africain multilingue du corpus d'entraînement, et introduit un cycle de dérive non permanent (fenêtre de visualisation puis retour automatique à la normale).</w:t>
+      </w:r>
+    </w:p>
+    <w:p>
+      <w:r>
+        <w:rPr>
+          <w:b/>
+        </w:rPr>
+        <w:t>🔴 Bug critique corrigé — désynchronisation du format d'entrée en recherche web</w:t>
+      </w:r>
+    </w:p>
+    <w:p>
+      <w:r>
+        <w:t>Diagnostic : api/src/routers/web_search.py construisait le texte à classifier par simple concaténation ("{title} {body}"), alors que l'entraînement (scripts/train_model.py) et le classifieur Spark (spark-app/src/nlp_classifier.py) utilisent le format "{title[:200]} [SEP] {body[:100]}". Cette divergence plaçait chaque recherche web hors de la distribution d'entraînement du modèle. Vérification empirique sur un même article réel de l'AFP : p_fake = 6,6 % avec le format d'entraînement contre 60,1 % avec l'ancien format de web_search.py. Correction : web_search.py reproduit désormais exactement le format d'entraînement.</w:t>
+      </w:r>
+    </w:p>
+    <w:p>
+      <w:r>
+        <w:rPr>
+          <w:b/>
+        </w:rPr>
+        <w:t>🔴 Décontamination MongoDB / Elasticsearch — statistiques faussées depuis des semaines</w:t>
+      </w:r>
+    </w:p>
+    <w:p>
+      <w:r>
+        <w:t>L'ancien service drift-injector tournait en mode démon 24/7 (toutes les 30 min), injectant des articles majoritairement fake (jusqu'à 90 %) en continu depuis des semaines. Résultat : 16 229 des 19 576 documents de la collection MongoDB (83 %) et autant sur Elasticsearch étaient des artefacts de simulation (sources synthétiques 'InfoBrûlante', 'VéritéCachée', 'AlerteComplot', etc., identifiables par le préfixe d'URL https://simulation.test/), faisant artificiellement grimper le taux de fake global affiché à ~80 %. Ces documents ont été supprimés des deux bases ; le taux de fake résiduel réel est revenu à ~52 %. Le service drift-injector est désormais désactivé par défaut (docker-compose.yml) : le drift ne se déclenche plus qu'à la demande, depuis le dashboard ou l'API.</w:t>
+      </w:r>
+    </w:p>
+    <w:p>
+      <w:r>
+        <w:rPr>
+          <w:b/>
+        </w:rPr>
+        <w:t>🔴 Seuil de décision relevé de 0.65 à 0.75</w:t>
+      </w:r>
+    </w:p>
+    <w:p>
+      <w:r>
+        <w:t>En complément de la correction du bug de format, le seuil de classification p_fake a été relevé de 0.65 à 0.75 dans nlp_classifier.py et web_search.py, réduisant davantage les faux positifs sur les dépêches d'agences officielles.</w:t>
+      </w:r>
+    </w:p>
+    <w:p>
+      <w:r>
+        <w:rPr>
+          <w:b/>
+        </w:rPr>
+        <w:t>🔴 Le drift n'est plus un état permanent — fenêtre de visualisation puis retour automatique</w:t>
+      </w:r>
+    </w:p>
+    <w:p>
+      <w:r>
+        <w:t>Auparavant, la phase de « récupération » suivait l'injection de drift avec seulement 5 secondes de délai, rendant le drift quasiment invisible dans Grafana/Streamlit avant sa propre correction. scripts/inject_drift_simulation.py introduit maintenant un paramètre visualization_window (60-600 s, 300 s = 5 min par défaut) : le drift reste actif et observable pendant cette fenêtre, puis des articles réels sont envoyés automatiquement pour ramener le modèle et les statistiques à la normale — sans intervention manuelle. Le endpoint POST /api/v1/drift/inject expose ce paramètre ; l'interface Streamlit propose un curseur (1-10 min) pour le régler. Testé de bout en bout : cycle complet drift → fenêtre → récupération automatique validé.</w:t>
+      </w:r>
+    </w:p>
+    <w:p>
+      <w:r>
+        <w:rPr>
+          <w:b/>
+        </w:rPr>
+        <w:t>🔴 Enrichissement du corpus d'entraînement — contexte africain multilingue</w:t>
+      </w:r>
+    </w:p>
+    <w:p>
+      <w:r>
+        <w:t>Le script scripts/download_african_datasets.py a été exécuté pour enrichir data/raw/africa_news/africa_news.csv : ajout de 2 742 articles réels MasakhaNEWS couvrant 11 langues africaines (amharique, haoussa, igbo, lingala, oromo, pidgin nigérian, shona, somali, swahili, tigrinya, yoruba) ainsi que des articles récents via Google News RSS (sources africaines). Le corpus africain total passe de 854 à 3 601 exemples. Limite constatée : Africa Check (source de fact-checks africains) est inaccessible depuis l'environnement de développement (blocage Cloudflare 403) ; le volume de fake news africaines authentiques reste donc limité (~77 exemples), documenté comme limite connue pour les travaux futurs. scripts/train_model.py applique un facteur de sur-pondération (--africa_boost, ×5 par défaut) sur les exemples africains via WeightedRandomSampler, sans supprimer aucune donnée existante (welfake, isot, liar, fakenewsnet conservés intégralement).</w:t>
+      </w:r>
+    </w:p>
+    <w:p>
+      <w:r>
+        <w:rPr>
+          <w:b/>
+        </w:rPr>
+        <w:t>🔴 Ré-entraînement complet du modèle Continual-DistilBERT</w:t>
+      </w:r>
+    </w:p>
+    <w:p>
+      <w:r>
+        <w:t>Un nouveau cycle d'entraînement complet a été lancé sur le corpus enrichi (55 356 exemples d'entraînement, 50/50 fake/réel). Le script train_model.py a été rendu résilient aux coupures (sauvegarde d'un checkpoint de reprise tous les 100 batchs, argument --save_every) suite à des interruptions dues à des déconnexions intempestives du disque externe pendant l'entraînement (voir point suivant).</w:t>
+      </w:r>
+    </w:p>
+    <w:p>
+      <w:r>
+        <w:rPr>
+          <w:b/>
+        </w:rPr>
+        <w:t>🔴 Stabilisation Docker — instabilité récurrente du disque externe, corrigée de façon permanente</w:t>
+      </w:r>
+    </w:p>
+    <w:p>
+      <w:r>
+        <w:t>Le disque externe hébergeant le projet s'est déconnecté/reconnecté à de multiples reprises pendant cette session (points de montage successifs local5→local6→local7→local8→disqueD), cassant à chaque fois les points de montage (bind mounts) Docker. Diagnostic confirmé via journalctl/dmesg : véritables erreurs matérielles SATA ("ata1.00: error: { UNC }"), pas un simple problème de configuration logicielle. Cause racine du changement de nom de dossier : la partition n'était déclarée nulle part dans /etc/fstab, donc udisks2/GNOME la remontait automatiquement sous un nouveau nom à chaque reconnexion. Correction définitive apportée : ajout d'une entrée fixe dans /etc/fstab basée sur l'UUID de la partition (et non plus sur un nom généré dynamiquement), avec l'option 'nofail' pour ne jamais bloquer le démarrage. Le pilote noyau ntfs3 s'étant révélé incompatible avec le volume après une déconnexion brutale (erreur 'bad superblock'), le montage a été basculé sur le pilote ntfs-3g (FUSE), qui s'est montré fiable. Le point de montage est désormais fixe et permanent : /mnt/disqueD/ISTIN/MASTER/M2/S1/PROJET TUTORE/desinformation-pipeline. Les volumes nommés Docker (mongodb_data, elasticsearch_data) n'ont à aucun moment été affectés — aucune perte de données sur toute la session malgré les multiples coupures.</w:t>
       </w:r>
     </w:p>
     <w:sectPr>

</xml_diff>